<commit_message>
update some debian folder files
</commit_message>
<xml_diff>
--- a/Acordes domingo/Jorge/Atrae mi corazón - Marcos Brunet.docx
+++ b/Acordes domingo/Jorge/Atrae mi corazón - Marcos Brunet.docx
@@ -128,12 +128,9 @@
           <w:color w:val="auto"/>
           <w:sz w:val="13"/>
           <w:szCs w:val="13"/>
-          <w:lang/>
         </w:rPr>
         <w:t>G</w:t>
       </w:r>
-      <w:bookmarkStart w:id="0" w:name="_GoBack"/>
-      <w:bookmarkEnd w:id="0"/>
       <w:r>
         <w:rPr>
           <w:rFonts w:ascii="Consolas" w:hAnsi="Consolas" w:cs="Consolas"/>
@@ -358,7 +355,37 @@
           <w:szCs w:val="13"/>
           <w:lang w:val="es-ES"/>
         </w:rPr>
-        <w:t>Más allá del velo yo voy</w:t>
+        <w:t>Más allá del velo yo v</w:t>
+      </w:r>
+      <w:r>
+        <w:rPr>
+          <w:rFonts w:hint="default" w:cs="Consolas"/>
+          <w:b w:val="0"/>
+          <w:bCs w:val="0"/>
+          <w:i w:val="0"/>
+          <w:iCs w:val="0"/>
+          <w:color w:val="auto"/>
+          <w:sz w:val="13"/>
+          <w:szCs w:val="13"/>
+          <w:lang/>
+        </w:rPr>
+        <w:t>o</w:t>
+      </w:r>
+      <w:bookmarkStart w:id="0" w:name="_GoBack"/>
+      <w:bookmarkEnd w:id="0"/>
+      <w:r>
+        <w:rPr>
+          <w:rFonts w:ascii="Consolas" w:hAnsi="Consolas" w:cs="Consolas"/>
+          <w:b w:val="0"/>
+          <w:bCs w:val="0"/>
+          <w:i w:val="0"/>
+          <w:iCs w:val="0"/>
+          <w:color w:val="auto"/>
+          <w:sz w:val="13"/>
+          <w:szCs w:val="13"/>
+          <w:lang w:val="es-ES"/>
+        </w:rPr>
+        <w:t>y</w:t>
       </w:r>
     </w:p>
     <w:p>

</xml_diff>